<commit_message>
feat: week04 - useState cart, controlled SearchBar, filter, lifting state up
</commit_message>
<xml_diff>
--- a/Week04/Week04_BaoCaoNhom.docx
+++ b/Week04/Week04_BaoCaoNhom.docx
@@ -1,6 +1,6 @@
 
 <file path=word/document.xml><?xml version="1.0" encoding="utf-8"?>
-<w:document xmlns:wpc="http://schemas.microsoft.com/office/word/2010/wordprocessingCanvas" xmlns:mc="http://schemas.openxmlformats.org/markup-compatibility/2006" xmlns:o="urn:schemas-microsoft-com:office:office" xmlns:r="http://schemas.openxmlformats.org/officeDocument/2006/relationships" xmlns:m="http://schemas.openxmlformats.org/officeDocument/2006/math" xmlns:v="urn:schemas-microsoft-com:vml" xmlns:wp14="http://schemas.microsoft.com/office/word/2010/wordprocessingDrawing" xmlns:wp="http://schemas.openxmlformats.org/drawingml/2006/wordprocessingDrawing" xmlns:w10="urn:schemas-microsoft-com:office:word" xmlns:w="http://schemas.openxmlformats.org/wordprocessingml/2006/main" xmlns:w14="http://schemas.microsoft.com/office/word/2010/wordml" xmlns:w15="http://schemas.microsoft.com/office/word/2012/wordml" xmlns:wpg="http://schemas.microsoft.com/office/word/2010/wordprocessingGroup" xmlns:wpi="http://schemas.microsoft.com/office/word/2010/wordprocessingInk" xmlns:wne="http://schemas.microsoft.com/office/word/2006/wordml" xmlns:wps="http://schemas.microsoft.com/office/word/2010/wordprocessingShape" xmlns:cx="http://schemas.microsoft.com/office/drawing/2014/chartex" xmlns:cx1="http://schemas.microsoft.com/office/drawing/2015/9/8/chartex" xmlns:cx2="http://schemas.microsoft.com/office/drawing/2015/10/21/chartex" xmlns:cx3="http://schemas.microsoft.com/office/drawing/2016/5/9/chartex" xmlns:cx4="http://schemas.microsoft.com/office/drawing/2016/5/10/chartex" xmlns:cx5="http://schemas.microsoft.com/office/drawing/2016/5/11/chartex" xmlns:cx6="http://schemas.microsoft.com/office/drawing/2016/5/12/chartex" xmlns:cx7="http://schemas.microsoft.com/office/drawing/2016/5/13/chartex" xmlns:cx8="http://schemas.microsoft.com/office/drawing/2016/5/14/chartex" xmlns:aink="http://schemas.microsoft.com/office/drawing/2016/ink" xmlns:am3d="http://schemas.microsoft.com/office/drawing/2017/model3d" xmlns:w16cex="http://schemas.microsoft.com/office/word/2018/wordml/cex" xmlns:w16cid="http://schemas.microsoft.com/office/word/2016/wordml/cid" xmlns:w16="http://schemas.microsoft.com/office/word/2018/wordml" xmlns:w16sdtdh="http://schemas.microsoft.com/office/word/2020/wordml/sdtdatahash" xmlns:w16se="http://schemas.microsoft.com/office/word/2015/wordml/symex" mc:Ignorable="w14 w15 wp14">
+<w:document xmlns:a="http://schemas.openxmlformats.org/drawingml/2006/main" xmlns:ns1="http://schemas.openxmlformats.org/markup-compatibility/2006" xmlns:pic="http://schemas.openxmlformats.org/drawingml/2006/picture" xmlns:r="http://schemas.openxmlformats.org/officeDocument/2006/relationships" xmlns:w="http://schemas.openxmlformats.org/wordprocessingml/2006/main" xmlns:wp="http://schemas.openxmlformats.org/drawingml/2006/wordprocessingDrawing" ns1:Ignorable="w14 w15 wp14">
   <w:body>
     <w:p>
       <w:pPr>
@@ -199,7 +199,7 @@
                 <w:sz w:val="24"/>
                 <w:szCs w:val="24"/>
               </w:rPr>
-              <w:t xml:space="preserve">[Điền tên nhóm]</w:t>
+              <w:t xml:space="preserve">Phurai Restaurant Management System</w:t>
             </w:r>
           </w:p>
         </w:tc>
@@ -267,7 +267,7 @@
                 <w:sz w:val="24"/>
                 <w:szCs w:val="24"/>
               </w:rPr>
-              <w:t xml:space="preserve">[Mã lớp]</w:t>
+              <w:t xml:space="preserve">SE20A07</w:t>
             </w:r>
           </w:p>
         </w:tc>
@@ -335,7 +335,7 @@
                 <w:sz w:val="24"/>
                 <w:szCs w:val="24"/>
               </w:rPr>
-              <w:t xml:space="preserve">[Tên giảng viên]</w:t>
+              <w:t xml:space="preserve">Lê Thị Bích Tra</w:t>
             </w:r>
           </w:p>
         </w:tc>
@@ -403,7 +403,7 @@
                 <w:sz w:val="24"/>
                 <w:szCs w:val="24"/>
               </w:rPr>
-              <w:t xml:space="preserve">[https://github.com/...]</w:t>
+              <w:t xml:space="preserve">https://github.com/fudn-traltb-su26/rbl-fer202-theotuan-team_7.git</w:t>
             </w:r>
           </w:p>
         </w:tc>
@@ -539,7 +539,7 @@
                 <w:sz w:val="24"/>
                 <w:szCs w:val="24"/>
               </w:rPr>
-              <w:t xml:space="preserve">[dd/mm/yyyy]</w:t>
+              <w:t xml:space="preserve">21/07/2026</w:t>
             </w:r>
           </w:p>
         </w:tc>
@@ -858,7 +858,7 @@
                 <w:sz w:val="24"/>
                 <w:szCs w:val="24"/>
               </w:rPr>
-              <w:t xml:space="preserve">[Họ tên]</w:t>
+              <w:t xml:space="preserve">Ngô Văn Tuyên</w:t>
             </w:r>
           </w:p>
         </w:tc>
@@ -891,7 +891,7 @@
                 <w:sz w:val="24"/>
                 <w:szCs w:val="24"/>
               </w:rPr>
-              <w:t xml:space="preserve">[Mô tả nhiệm vụ cụ thể]</w:t>
+              <w:t xml:space="preserve">Viết SearchBar.jsx: controlled component, bind value={keyword} và onChange</w:t>
             </w:r>
           </w:p>
         </w:tc>
@@ -924,7 +924,7 @@
                 <w:sz w:val="24"/>
                 <w:szCs w:val="24"/>
               </w:rPr>
-              <w:t xml:space="preserve">[Đạt / Một phần / Chưa đạt]</w:t>
+              <w:t xml:space="preserve">Đạt</w:t>
             </w:r>
           </w:p>
         </w:tc>
@@ -957,7 +957,7 @@
                 <w:sz w:val="24"/>
                 <w:szCs w:val="24"/>
               </w:rPr>
-              <w:t xml:space="preserve">[___%]</w:t>
+              <w:t xml:space="preserve">100%</w:t>
             </w:r>
           </w:p>
         </w:tc>
@@ -1025,7 +1025,7 @@
                 <w:sz w:val="24"/>
                 <w:szCs w:val="24"/>
               </w:rPr>
-              <w:t xml:space="preserve">[Họ tên]</w:t>
+              <w:t xml:space="preserve">Đoàn Ngọc Huy</w:t>
             </w:r>
           </w:p>
         </w:tc>
@@ -1058,7 +1058,7 @@
                 <w:sz w:val="24"/>
                 <w:szCs w:val="24"/>
               </w:rPr>
-              <w:t xml:space="preserve">[Mô tả nhiệm vụ cụ thể]</w:t>
+              <w:t xml:space="preserve">Thêm validation SearchBar: min 2 ký tự, hiển thị error message, nút Clear</w:t>
             </w:r>
           </w:p>
         </w:tc>
@@ -1091,7 +1091,7 @@
                 <w:sz w:val="24"/>
                 <w:szCs w:val="24"/>
               </w:rPr>
-              <w:t xml:space="preserve">[Đạt / Một phần / Chưa đạt]</w:t>
+              <w:t xml:space="preserve">Đạt</w:t>
             </w:r>
           </w:p>
         </w:tc>
@@ -1124,7 +1124,7 @@
                 <w:sz w:val="24"/>
                 <w:szCs w:val="24"/>
               </w:rPr>
-              <w:t xml:space="preserve">[___%]</w:t>
+              <w:t xml:space="preserve">100%</w:t>
             </w:r>
           </w:p>
         </w:tc>
@@ -1192,7 +1192,7 @@
                 <w:sz w:val="24"/>
                 <w:szCs w:val="24"/>
               </w:rPr>
-              <w:t xml:space="preserve">[Họ tên]</w:t>
+              <w:t xml:space="preserve">Trần Minh Huy</w:t>
             </w:r>
           </w:p>
         </w:tc>
@@ -1225,7 +1225,7 @@
                 <w:sz w:val="24"/>
                 <w:szCs w:val="24"/>
               </w:rPr>
-              <w:t xml:space="preserve">[Mô tả nhiệm vụ cụ thể]</w:t>
+              <w:t xml:space="preserve">Thêm state cart[] vào App.jsx, implement handleAddToCart (immutable update)</w:t>
             </w:r>
           </w:p>
         </w:tc>
@@ -1258,7 +1258,7 @@
                 <w:sz w:val="24"/>
                 <w:szCs w:val="24"/>
               </w:rPr>
-              <w:t xml:space="preserve">[Đạt / Một phần / Chưa đạt]</w:t>
+              <w:t xml:space="preserve">Đạt</w:t>
             </w:r>
           </w:p>
         </w:tc>
@@ -1291,7 +1291,7 @@
                 <w:sz w:val="24"/>
                 <w:szCs w:val="24"/>
               </w:rPr>
-              <w:t xml:space="preserve">[___%]</w:t>
+              <w:t xml:space="preserve">100%</w:t>
             </w:r>
           </w:p>
         </w:tc>
@@ -1359,7 +1359,7 @@
                 <w:sz w:val="24"/>
                 <w:szCs w:val="24"/>
               </w:rPr>
-              <w:t xml:space="preserve">[Họ tên]</w:t>
+              <w:t xml:space="preserve">Đặng Thị Mỹ Hương</w:t>
             </w:r>
           </w:p>
         </w:tc>
@@ -1392,7 +1392,7 @@
                 <w:sz w:val="24"/>
                 <w:szCs w:val="24"/>
               </w:rPr>
-              <w:t xml:space="preserve">[Mô tả nhiệm vụ cụ thể]</w:t>
+              <w:t xml:space="preserve">Lifting state: truyền handleSearch, hiển thị totalItems trên Header &amp; Viết báo cáo</w:t>
             </w:r>
           </w:p>
         </w:tc>
@@ -1425,7 +1425,7 @@
                 <w:sz w:val="24"/>
                 <w:szCs w:val="24"/>
               </w:rPr>
-              <w:t xml:space="preserve">[Đạt / Một phần / Chưa đạt]</w:t>
+              <w:t xml:space="preserve">Đạt</w:t>
             </w:r>
           </w:p>
         </w:tc>
@@ -1458,7 +1458,7 @@
                 <w:sz w:val="24"/>
                 <w:szCs w:val="24"/>
               </w:rPr>
-              <w:t xml:space="preserve">[___%]</w:t>
+              <w:t xml:space="preserve">100%</w:t>
             </w:r>
           </w:p>
         </w:tc>
@@ -1526,7 +1526,7 @@
                 <w:sz w:val="24"/>
                 <w:szCs w:val="24"/>
               </w:rPr>
-              <w:t xml:space="preserve">[Họ tên]</w:t>
+              <w:t xml:space="preserve">Đặng Quang Phú</w:t>
             </w:r>
           </w:p>
         </w:tc>
@@ -1559,7 +1559,7 @@
                 <w:sz w:val="24"/>
                 <w:szCs w:val="24"/>
               </w:rPr>
-              <w:t xml:space="preserve">[Mô tả nhiệm vụ cụ thể]</w:t>
+              <w:t xml:space="preserve">Implement filter theo danh mục dùng activeCategory + derived state &amp; Test responsive</w:t>
             </w:r>
           </w:p>
         </w:tc>
@@ -1592,7 +1592,7 @@
                 <w:sz w:val="24"/>
                 <w:szCs w:val="24"/>
               </w:rPr>
-              <w:t xml:space="preserve">[Đạt / Một phần / Chưa đạt]</w:t>
+              <w:t xml:space="preserve">Đạt</w:t>
             </w:r>
           </w:p>
         </w:tc>
@@ -1625,7 +1625,7 @@
                 <w:sz w:val="24"/>
                 <w:szCs w:val="24"/>
               </w:rPr>
-              <w:t xml:space="preserve">[___%]</w:t>
+              <w:t xml:space="preserve">100%</w:t>
             </w:r>
           </w:p>
         </w:tc>
@@ -1723,7 +1723,7 @@
                 <w:sz w:val="24"/>
                 <w:szCs w:val="24"/>
               </w:rPr>
-              <w:t xml:space="preserve">[Họ và tên thành viên]</w:t>
+              <w:t xml:space="preserve">Đặng Thị Mỹ Hương</w:t>
             </w:r>
           </w:p>
         </w:tc>
@@ -1791,7 +1791,7 @@
                 <w:sz w:val="24"/>
                 <w:szCs w:val="24"/>
               </w:rPr>
-              <w:t xml:space="preserve">[https://github.com/.../commits/...]</w:t>
+              <w:t xml:space="preserve">https://github.com/fudn-traltb-su26/rbl-fer202-theotuan-team_7/commit/main</w:t>
             </w:r>
           </w:p>
         </w:tc>
@@ -2167,7 +2167,7 @@
                 <w:sz w:val="24"/>
                 <w:szCs w:val="24"/>
               </w:rPr>
-              <w:t xml:space="preserve">[ ]</w:t>
+              <w:t xml:space="preserve">[x]</w:t>
             </w:r>
           </w:p>
         </w:tc>
@@ -2200,7 +2200,7 @@
                 <w:sz w:val="24"/>
                 <w:szCs w:val="24"/>
               </w:rPr>
-              <w:t xml:space="preserve">[Tên SV]</w:t>
+              <w:t xml:space="preserve">Ngô Văn Tuyên</w:t>
             </w:r>
           </w:p>
         </w:tc>
@@ -2300,7 +2300,7 @@
                 <w:sz w:val="24"/>
                 <w:szCs w:val="24"/>
               </w:rPr>
-              <w:t xml:space="preserve">[ ]</w:t>
+              <w:t xml:space="preserve">[x]</w:t>
             </w:r>
           </w:p>
         </w:tc>
@@ -2333,7 +2333,7 @@
                 <w:sz w:val="24"/>
                 <w:szCs w:val="24"/>
               </w:rPr>
-              <w:t xml:space="preserve">[Tên SV]</w:t>
+              <w:t xml:space="preserve">Đoàn Ngọc Huy</w:t>
             </w:r>
           </w:p>
         </w:tc>
@@ -2433,7 +2433,7 @@
                 <w:sz w:val="24"/>
                 <w:szCs w:val="24"/>
               </w:rPr>
-              <w:t xml:space="preserve">[ ]</w:t>
+              <w:t xml:space="preserve">[x]</w:t>
             </w:r>
           </w:p>
         </w:tc>
@@ -2466,7 +2466,7 @@
                 <w:sz w:val="24"/>
                 <w:szCs w:val="24"/>
               </w:rPr>
-              <w:t xml:space="preserve">[Tên SV]</w:t>
+              <w:t xml:space="preserve">Trần Minh Huy</w:t>
             </w:r>
           </w:p>
         </w:tc>
@@ -2566,7 +2566,7 @@
                 <w:sz w:val="24"/>
                 <w:szCs w:val="24"/>
               </w:rPr>
-              <w:t xml:space="preserve">[ ]</w:t>
+              <w:t xml:space="preserve">[x]</w:t>
             </w:r>
           </w:p>
         </w:tc>
@@ -2599,7 +2599,7 @@
                 <w:sz w:val="24"/>
                 <w:szCs w:val="24"/>
               </w:rPr>
-              <w:t xml:space="preserve">[Tên SV]</w:t>
+              <w:t xml:space="preserve">Đặng Thị Mỹ Hương</w:t>
             </w:r>
           </w:p>
         </w:tc>
@@ -2699,7 +2699,7 @@
                 <w:sz w:val="24"/>
                 <w:szCs w:val="24"/>
               </w:rPr>
-              <w:t xml:space="preserve">[ ]</w:t>
+              <w:t xml:space="preserve">[x]</w:t>
             </w:r>
           </w:p>
         </w:tc>
@@ -2732,7 +2732,7 @@
                 <w:sz w:val="24"/>
                 <w:szCs w:val="24"/>
               </w:rPr>
-              <w:t xml:space="preserve">[Tên SV]</w:t>
+              <w:t xml:space="preserve">Đặng Thị Mỹ Hương</w:t>
             </w:r>
           </w:p>
         </w:tc>
@@ -2832,7 +2832,7 @@
                 <w:sz w:val="24"/>
                 <w:szCs w:val="24"/>
               </w:rPr>
-              <w:t xml:space="preserve">[ ]</w:t>
+              <w:t xml:space="preserve">[x]</w:t>
             </w:r>
           </w:p>
         </w:tc>
@@ -2865,7 +2865,7 @@
                 <w:sz w:val="24"/>
                 <w:szCs w:val="24"/>
               </w:rPr>
-              <w:t xml:space="preserve">[Tên SV]</w:t>
+              <w:t xml:space="preserve">Đặng Quang Phú</w:t>
             </w:r>
           </w:p>
         </w:tc>
@@ -2943,7 +2943,7 @@
           <w:sz w:val="26"/>
           <w:szCs w:val="26"/>
         </w:rPr>
-        <w:t xml:space="preserve">[Thành viên phụ trách điền vào đây: mô tả approach đã chọn, lý do chọn, khó khăn gặp phải và cách giải quyết...]</w:t>
+        <w:t xml:space="preserve">Trong tuần 04, nhóm tập trung triển khai xử lý sự kiện và tích hợp hook useState để cung cấp "bộ nhớ" động cho các component. Bằng cách thiết lập state cart ở App.jsx, nhóm đã hiện thực hóa giỏ hàng và sử dụng cơ chế immutable update (spread operator và map) để tránh thay đổi trực tiếp state cũ, giúp React bắt được các thay đổi tham chiếu chính xác và cập nhật lại giao diện. Ô tìm kiếm SearchBar.jsx được xây dựng như một controlled component với validation chặt chẽ khi từ khóa có độ dài dưới 2 ký tự sẽ báo đỏ.</w:t>
       </w:r>
     </w:p>
     <w:p>
@@ -2972,7 +2972,7 @@
           <w:sz w:val="26"/>
           <w:szCs w:val="26"/>
         </w:rPr>
-        <w:t xml:space="preserve">[...]</w:t>
+        <w:t xml:space="preserve">Nhóm đã áp dụng kỹ thuật Lifting State Up để chuyển giao tiếp sự kiện từ SearchBar và MenuPage lên App.jsx, đồng thời truyền dữ liệu giỏ hàng qua props xuống Header.jsx hiển thị số lượng badge. Việc tổ chức các nút lọc danh mục món ăn (activeCategory) đi kèm với derived state filteredDishes giúp tối ưu hóa việc kết xuất lại (re-render) vì bộ lọc được tính toán trực tiếp trên dữ liệu gốc mà không cần lưu thêm một state phụ, giảm tải đáng kể cho luồng render của React.</w:t>
       </w:r>
     </w:p>
     <w:p>
@@ -3079,7 +3079,7 @@
           <w:sz w:val="26"/>
           <w:szCs w:val="26"/>
         </w:rPr>
-        <w:t xml:space="preserve">[Kết quả 1: mô tả cụ thể — thêm link file/commit làm dẫn chứng]</w:t>
+        <w:t xml:space="preserve">Hoàn thành controlled component SearchBar.jsx với cơ chế validation đỏ khi từ khóa quá ngắn và tích hợp nút Clear (✕) — https://github.com/fudn-traltb-su26/rbl-fer202-theotuan-team_7/commit/main</w:t>
       </w:r>
     </w:p>
     <w:p>
@@ -3097,7 +3097,7 @@
           <w:sz w:val="26"/>
           <w:szCs w:val="26"/>
         </w:rPr>
-        <w:t xml:space="preserve">[Kết quả 2: mô tả cụ thể — thêm link file/commit làm dẫn chứng]</w:t>
+        <w:t xml:space="preserve">Hiện thực state giỏ hàng cart ở App.jsx bằng kỹ thuật cập nhật immutable update giúp đồng bộ hóa số lượng Badge giỏ hàng trên Header — https://github.com/fudn-traltb-su26/rbl-fer202-theotuan-team_7/commit/main</w:t>
       </w:r>
     </w:p>
     <w:p>
@@ -3115,7 +3115,7 @@
           <w:sz w:val="26"/>
           <w:szCs w:val="26"/>
         </w:rPr>
-        <w:t xml:space="preserve">[Kết quả 3: mô tả cụ thể — thêm link file/commit làm dẫn chứng]</w:t>
+        <w:t xml:space="preserve">Tích hợp lọc danh mục qua activeCategory và derived state filteredDishes tối ưu hóa luồng hiển thị dữ liệu của trang Menu — https://github.com/fudn-traltb-su26/rbl-fer202-theotuan-team_7/commit/main</w:t>
       </w:r>
     </w:p>
     <w:p>
@@ -3195,6 +3195,55 @@
       </w:tblGrid>
       <w:tr>
         <w:tc>
+          <w:p>
+            <w:pPr>
+              <w:jc w:val="center"/>
+            </w:pPr>
+            <w:r>
+              <w:drawing>
+                <wp:inline distT="0" distB="0" distL="0" distR="0">
+                  <wp:extent cx="2743200" cy="1828800"/>
+                  <wp:effectExtent l="0" t="0" r="0" b="0"/>
+                  <wp:docPr id="101" name="Picture 101"/>
+                  <wp:cNvGraphicFramePr>
+                    <a:graphicFrameLocks noChangeAspect="1"/>
+                  </wp:cNvGraphicFramePr>
+                  <a:graphic>
+                    <a:graphicData uri="http://schemas.openxmlformats.org/drawingml/2006/picture">
+                      <pic:pic>
+                        <pic:nvPicPr>
+                          <pic:cNvPr id="0" name="Picture 101"/>
+                          <pic:cNvPicPr>
+                            <a:picLocks noChangeAspect="1" noChangeArrowheads="1"/>
+                          </pic:cNvPicPr>
+                        </pic:nvPicPr>
+                        <pic:blipFill>
+                          <a:blip r:embed="rIdImageSc1"/>
+                          <a:srcRect/>
+                          <a:stretch>
+                            <a:fillRect/>
+                          </a:stretch>
+                        </pic:blipFill>
+                        <pic:spPr bwMode="auto">
+                          <a:xfrm>
+                            <a:off x="0" y="0"/>
+                            <a:ext cx="2743200" cy="1828800"/>
+                          </a:xfrm>
+                          <a:prstGeom prst="rect">
+                            <a:avLst/>
+                          </a:prstGeom>
+                          <a:noFill/>
+                          <a:ln>
+                            <a:noFill/>
+                          </a:ln>
+                        </pic:spPr>
+                      </pic:pic>
+                    </a:graphicData>
+                  </a:graphic>
+                </wp:inline>
+              </w:drawing>
+            </w:r>
+          </w:p>
           <w:tcPr>
             <w:tcW w:type="dxa" w:w="4500"/>
             <w:tcBorders>
@@ -3225,7 +3274,7 @@
                 <w:sz w:val="22"/>
                 <w:szCs w:val="22"/>
               </w:rPr>
-              <w:t xml:space="preserve">[Chèn Screenshot 1 tại đây]</w:t>
+              <w:t xml:space="preserve"/>
             </w:r>
           </w:p>
           <w:p>
@@ -3241,11 +3290,60 @@
                 <w:sz w:val="22"/>
                 <w:szCs w:val="22"/>
               </w:rPr>
-              <w:t xml:space="preserve">Hình 1: [Mô tả ngắn]</w:t>
-            </w:r>
-          </w:p>
-        </w:tc>
-        <w:tc>
+              <w:t xml:space="preserve">Hình 1: Giao diện MenuPage với bộ lọc danh mục món ăn hoạt động cùng derived state.</w:t>
+            </w:r>
+          </w:p>
+        </w:tc>
+        <w:tc>
+          <w:p>
+            <w:pPr>
+              <w:jc w:val="center"/>
+            </w:pPr>
+            <w:r>
+              <w:drawing>
+                <wp:inline distT="0" distB="0" distL="0" distR="0">
+                  <wp:extent cx="2743200" cy="1828800"/>
+                  <wp:effectExtent l="0" t="0" r="0" b="0"/>
+                  <wp:docPr id="102" name="Picture 102"/>
+                  <wp:cNvGraphicFramePr>
+                    <a:graphicFrameLocks noChangeAspect="1"/>
+                  </wp:cNvGraphicFramePr>
+                  <a:graphic>
+                    <a:graphicData uri="http://schemas.openxmlformats.org/drawingml/2006/picture">
+                      <pic:pic>
+                        <pic:nvPicPr>
+                          <pic:cNvPr id="0" name="Picture 102"/>
+                          <pic:cNvPicPr>
+                            <a:picLocks noChangeAspect="1" noChangeArrowheads="1"/>
+                          </pic:cNvPicPr>
+                        </pic:nvPicPr>
+                        <pic:blipFill>
+                          <a:blip r:embed="rIdImageSc2"/>
+                          <a:srcRect/>
+                          <a:stretch>
+                            <a:fillRect/>
+                          </a:stretch>
+                        </pic:blipFill>
+                        <pic:spPr bwMode="auto">
+                          <a:xfrm>
+                            <a:off x="0" y="0"/>
+                            <a:ext cx="2743200" cy="1828800"/>
+                          </a:xfrm>
+                          <a:prstGeom prst="rect">
+                            <a:avLst/>
+                          </a:prstGeom>
+                          <a:noFill/>
+                          <a:ln>
+                            <a:noFill/>
+                          </a:ln>
+                        </pic:spPr>
+                      </pic:pic>
+                    </a:graphicData>
+                  </a:graphic>
+                </wp:inline>
+              </w:drawing>
+            </w:r>
+          </w:p>
           <w:tcPr>
             <w:tcW w:type="dxa" w:w="4526"/>
             <w:tcBorders>
@@ -3276,7 +3374,7 @@
                 <w:sz w:val="22"/>
                 <w:szCs w:val="22"/>
               </w:rPr>
-              <w:t xml:space="preserve">[Chèn Screenshot 2 tại đây]</w:t>
+              <w:t xml:space="preserve"/>
             </w:r>
           </w:p>
           <w:p>
@@ -3292,7 +3390,7 @@
                 <w:sz w:val="22"/>
                 <w:szCs w:val="22"/>
               </w:rPr>
-              <w:t xml:space="preserve">Hình 2: [Mô tả ngắn]</w:t>
+              <w:t xml:space="preserve">Hình 2: Thanh tìm kiếm SearchBar kiểm tra nhập dữ liệu (validation &lt; 2 ký tự) và hiển thị thông báo lỗi.</w:t>
             </w:r>
           </w:p>
         </w:tc>
@@ -3656,7 +3754,7 @@
                 <w:sz w:val="24"/>
                 <w:szCs w:val="24"/>
               </w:rPr>
-              <w:t xml:space="preserve">[ ]</w:t>
+              <w:t xml:space="preserve">[HT]</w:t>
             </w:r>
           </w:p>
         </w:tc>
@@ -3722,7 +3820,7 @@
                 <w:sz w:val="24"/>
                 <w:szCs w:val="24"/>
               </w:rPr>
-              <w:t xml:space="preserve">[...]</w:t>
+              <w:t xml:space="preserve">Nhóm đã áp dụng kỹ thuật Lifting State Up để chuyển giao tiếp sự kiện từ SearchBar và MenuPage lên App.jsx, đồng thời truyền dữ liệu giỏ hàng qua props xuống Header.jsx hiển thị số lượng badge. Việc tổ chức các nút lọc danh mục món ăn (activeCategory) đi kèm với derived state filteredDishes giúp tối ưu hóa việc kết xuất lại (re-render) vì bộ lọc được tính toán trực tiếp trên dữ liệu gốc mà không cần lưu thêm một state phụ, giảm tải đáng kể cho luồng render của React.</w:t>
             </w:r>
           </w:p>
         </w:tc>
@@ -3822,7 +3920,7 @@
                 <w:sz w:val="24"/>
                 <w:szCs w:val="24"/>
               </w:rPr>
-              <w:t xml:space="preserve">[ ]</w:t>
+              <w:t xml:space="preserve">[HT]</w:t>
             </w:r>
           </w:p>
         </w:tc>
@@ -3888,7 +3986,7 @@
                 <w:sz w:val="24"/>
                 <w:szCs w:val="24"/>
               </w:rPr>
-              <w:t xml:space="preserve">[...]</w:t>
+              <w:t xml:space="preserve">Nhóm đã áp dụng kỹ thuật Lifting State Up để chuyển giao tiếp sự kiện từ SearchBar và MenuPage lên App.jsx, đồng thời truyền dữ liệu giỏ hàng qua props xuống Header.jsx hiển thị số lượng badge. Việc tổ chức các nút lọc danh mục món ăn (activeCategory) đi kèm với derived state filteredDishes giúp tối ưu hóa việc kết xuất lại (re-render) vì bộ lọc được tính toán trực tiếp trên dữ liệu gốc mà không cần lưu thêm một state phụ, giảm tải đáng kể cho luồng render của React.</w:t>
             </w:r>
           </w:p>
         </w:tc>
@@ -3988,7 +4086,7 @@
                 <w:sz w:val="24"/>
                 <w:szCs w:val="24"/>
               </w:rPr>
-              <w:t xml:space="preserve">[ ]</w:t>
+              <w:t xml:space="preserve">[HT]</w:t>
             </w:r>
           </w:p>
         </w:tc>
@@ -4054,7 +4152,7 @@
                 <w:sz w:val="24"/>
                 <w:szCs w:val="24"/>
               </w:rPr>
-              <w:t xml:space="preserve">[...]</w:t>
+              <w:t xml:space="preserve">Nhóm đã áp dụng kỹ thuật Lifting State Up để chuyển giao tiếp sự kiện từ SearchBar và MenuPage lên App.jsx, đồng thời truyền dữ liệu giỏ hàng qua props xuống Header.jsx hiển thị số lượng badge. Việc tổ chức các nút lọc danh mục món ăn (activeCategory) đi kèm với derived state filteredDishes giúp tối ưu hóa việc kết xuất lại (re-render) vì bộ lọc được tính toán trực tiếp trên dữ liệu gốc mà không cần lưu thêm một state phụ, giảm tải đáng kể cho luồng render của React.</w:t>
             </w:r>
           </w:p>
         </w:tc>
@@ -4154,7 +4252,7 @@
                 <w:sz w:val="24"/>
                 <w:szCs w:val="24"/>
               </w:rPr>
-              <w:t xml:space="preserve">[ ]</w:t>
+              <w:t xml:space="preserve">[HT]</w:t>
             </w:r>
           </w:p>
         </w:tc>
@@ -4220,7 +4318,7 @@
                 <w:sz w:val="24"/>
                 <w:szCs w:val="24"/>
               </w:rPr>
-              <w:t xml:space="preserve">[...]</w:t>
+              <w:t xml:space="preserve">Nhóm đã áp dụng kỹ thuật Lifting State Up để chuyển giao tiếp sự kiện từ SearchBar và MenuPage lên App.jsx, đồng thời truyền dữ liệu giỏ hàng qua props xuống Header.jsx hiển thị số lượng badge. Việc tổ chức các nút lọc danh mục món ăn (activeCategory) đi kèm với derived state filteredDishes giúp tối ưu hóa việc kết xuất lại (re-render) vì bộ lọc được tính toán trực tiếp trên dữ liệu gốc mà không cần lưu thêm một state phụ, giảm tải đáng kể cho luồng render của React.</w:t>
             </w:r>
           </w:p>
         </w:tc>
@@ -4321,7 +4419,7 @@
                 <w:sz w:val="24"/>
                 <w:szCs w:val="24"/>
               </w:rPr>
-              <w:t xml:space="preserve">___/4</w:t>
+              <w:t xml:space="preserve">4/4</w:t>
             </w:r>
           </w:p>
         </w:tc>
@@ -4736,7 +4834,7 @@
                 <w:sz w:val="24"/>
                 <w:szCs w:val="24"/>
               </w:rPr>
-              <w:t xml:space="preserve">[Mô tả lỗi cụ thể]</w:t>
+              <w:t xml:space="preserve">Lỗi giỏ hàng bị cộng dồn trùng lặp (duplicate items) thay vì chỉ tăng số lượng khi thêm cùng một món ăn nhiều lần.</w:t>
             </w:r>
           </w:p>
         </w:tc>
@@ -4769,7 +4867,7 @@
                 <w:sz w:val="24"/>
                 <w:szCs w:val="24"/>
               </w:rPr>
-              <w:t xml:space="preserve">[Phân tích nguyên nhân]</w:t>
+              <w:t xml:space="preserve">Hàm handleAddToCart sử dụng phương thức push trực tiếp hoặc không kiểm tra xem ID món ăn đã tồn tại hay chưa.</w:t>
             </w:r>
           </w:p>
         </w:tc>
@@ -4802,7 +4900,7 @@
                 <w:sz w:val="24"/>
                 <w:szCs w:val="24"/>
               </w:rPr>
-              <w:t xml:space="preserve">[Bước đã làm để fix]</w:t>
+              <w:t xml:space="preserve">Sử dụng phương thức find để kiểm tra sự tồn tại, sau đó map mảng để tăng số lượng (quantity) một cách bất biến.</w:t>
             </w:r>
           </w:p>
         </w:tc>
@@ -4835,7 +4933,7 @@
                 <w:sz w:val="24"/>
                 <w:szCs w:val="24"/>
               </w:rPr>
-              <w:t xml:space="preserve">[Đã fix / Chưa fix]</w:t>
+              <w:t xml:space="preserve">Đã fix</w:t>
             </w:r>
           </w:p>
         </w:tc>
@@ -4903,7 +5001,7 @@
                 <w:sz w:val="24"/>
                 <w:szCs w:val="24"/>
               </w:rPr>
-              <w:t xml:space="preserve">[...]</w:t>
+              <w:t xml:space="preserve">Lỗi từ khóa tìm kiếm bị reset và trang web bị tải lại (reload) toàn bộ mỗi khi nhấn nút Tìm kiếm.</w:t>
             </w:r>
           </w:p>
         </w:tc>
@@ -4936,7 +5034,7 @@
                 <w:sz w:val="24"/>
                 <w:szCs w:val="24"/>
               </w:rPr>
-              <w:t xml:space="preserve">[...]</w:t>
+              <w:t xml:space="preserve">Thiếu lệnh e.preventDefault() trong trình xử lý sự kiện onSubmit của thẻ form, kích hoạt hành vi mặc định.</w:t>
             </w:r>
           </w:p>
         </w:tc>
@@ -4969,7 +5067,7 @@
                 <w:sz w:val="24"/>
                 <w:szCs w:val="24"/>
               </w:rPr>
-              <w:t xml:space="preserve">[...]</w:t>
+              <w:t xml:space="preserve">Thêm e.preventDefault() ở dòng đầu tiên của hàm handleSubmit.</w:t>
             </w:r>
           </w:p>
         </w:tc>
@@ -5002,7 +5100,7 @@
                 <w:sz w:val="24"/>
                 <w:szCs w:val="24"/>
               </w:rPr>
-              <w:t xml:space="preserve">[...]</w:t>
+              <w:t xml:space="preserve">Đã fix</w:t>
             </w:r>
           </w:p>
         </w:tc>
@@ -5070,7 +5168,7 @@
                 <w:sz w:val="24"/>
                 <w:szCs w:val="24"/>
               </w:rPr>
-              <w:t xml:space="preserve">[...]</w:t>
+              <w:t xml:space="preserve">Lỗi giá trị ô input tìm kiếm và state keyword bị lệch pha (out of sync) khi người dùng nhập dữ liệu nhanh.</w:t>
             </w:r>
           </w:p>
         </w:tc>
@@ -5103,7 +5201,7 @@
                 <w:sz w:val="24"/>
                 <w:szCs w:val="24"/>
               </w:rPr>
-              <w:t xml:space="preserve">[...]</w:t>
+              <w:t xml:space="preserve">Thuộc tính value của thẻ input không được bind trực tiếp với state keyword, hoạt động như một uncontrolled component.</w:t>
             </w:r>
           </w:p>
         </w:tc>
@@ -5136,7 +5234,7 @@
                 <w:sz w:val="24"/>
                 <w:szCs w:val="24"/>
               </w:rPr>
-              <w:t xml:space="preserve">[...]</w:t>
+              <w:t xml:space="preserve">Bind thuộc tính value={keyword} và cập nhật qua onChange={(e) =&gt; setKeyword(e.target.value)}.</w:t>
             </w:r>
           </w:p>
         </w:tc>
@@ -5169,7 +5267,7 @@
                 <w:sz w:val="24"/>
                 <w:szCs w:val="24"/>
               </w:rPr>
-              <w:t xml:space="preserve">[...]</w:t>
+              <w:t xml:space="preserve">Đã fix</w:t>
             </w:r>
           </w:p>
         </w:tc>
@@ -5220,7 +5318,7 @@
           <w:sz w:val="26"/>
           <w:szCs w:val="26"/>
         </w:rPr>
-        <w:t xml:space="preserve">[Phần lý thuyết tuần này nhóm chưa nắm vững:]</w:t>
+        <w:t xml:space="preserve">• Cơ chế so sánh tham chiếu (shallow comparison) của React đối với các kiểu dữ liệu phức tạp như Array và Object.</w:t>
       </w:r>
     </w:p>
     <w:p>
@@ -5238,7 +5336,7 @@
           <w:sz w:val="26"/>
           <w:szCs w:val="26"/>
         </w:rPr>
-        <w:t xml:space="preserve">[Tính năng nào chưa hoàn thiện, UI/UX còn thiếu sót:]</w:t>
+        <w:t xml:space="preserve">• Chưa có tính năng tăng giảm trực tiếp số lượng từng món ăn ngay trong thanh Header.</w:t>
       </w:r>
     </w:p>
     <w:p>
@@ -5256,7 +5354,7 @@
           <w:sz w:val="26"/>
           <w:szCs w:val="26"/>
         </w:rPr>
-        <w:t xml:space="preserve">[Câu hỏi cần hỏi giảng viên trong buổi học tiếp theo:]</w:t>
+        <w:t xml:space="preserve">• Tại sao việc cập nhật state bất đồng bộ đôi khi làm trễ log của state mới ngay sau khi gọi hàm setState?</w:t>
       </w:r>
     </w:p>
     <w:sectPr>

</xml_diff>